<commit_message>
Manual: viewer is now LIVE — replace "coming soon" with usage steps
All 5 wall-viewer phases shipped, so the manual section 10 is now
"LIVE" instead of "coming soon". Replaced the futures-tense
description with step-by-step usage:
  10.1 — 10 numbered steps for actual operation (drop file, frame
         switch, pan/zoom, select stick, add op, delete op, drag
         move, drag resize, draw stick, undo/redo, save)
  10.2 — what it edits (per-job .rfy) vs what it doesn't (rules)
  10.3 — visual key for all 11 tool-op shape categories
  10.4 — locked-in build approach (SVG + React + Zustand, perf
         strategy, isolation guarantee, save round-trip)

Output: docs/HYTEK_RFY_Tools_User_Guide.docx + OneDrive copy
synced.

Co-Authored-By: Claude Opus 4.7 (1M context) <noreply@anthropic.com>
</commit_message>
<xml_diff>
--- a/docs/HYTEK_RFY_Tools_User_Guide.docx
+++ b/docs/HYTEK_RFY_Tools_User_Guide.docx
@@ -4323,7 +4323,7 @@
           <w:sz w:val="36"/>
           <w:szCs w:val="36"/>
         </w:rPr>
-        <w:t xml:space="preserve">10. Wall Editor (/viewer) — coming soon</w:t>
+        <w:t xml:space="preserve">10. Wall Editor (/viewer) — LIVE</w:t>
       </w:r>
     </w:p>
     <w:p>
@@ -4338,7 +4338,24 @@
           <w:sz w:val="21"/>
           <w:szCs w:val="21"/>
         </w:rPr>
-        <w:t xml:space="preserve">This page is being built — design approved 2026-05-03. It does NOT exist in the live app yet. This section documents what it will do so you can plan around the timeline.</w:t>
+        <w:t xml:space="preserve">All five build phases shipped 2026-05-03. The Wall Editor is now the primary yellow button in the home-page navigation.</w:t>
+      </w:r>
+    </w:p>
+    <w:p>
+      <w:pPr>
+        <w:spacing w:after="120" w:before="0"/>
+        <w:jc w:val="left"/>
+      </w:pPr>
+      <w:r>
+        <w:rPr>
+          <w:rFonts w:ascii="Arial" w:cs="Arial" w:eastAsia="Arial" w:hAnsi="Arial"/>
+          <w:b/>
+          <w:bCs/>
+          <w:color w:val="333333"/>
+          <w:sz w:val="21"/>
+          <w:szCs w:val="21"/>
+        </w:rPr>
+        <w:t xml:space="preserve">Live URL:  https://hytek-rfy-tools.vercel.app/viewer</w:t>
       </w:r>
     </w:p>
     <w:p>
@@ -4355,157 +4372,157 @@
           <w:sz w:val="28"/>
           <w:szCs w:val="28"/>
         </w:rPr>
-        <w:t xml:space="preserve">10.1  What it will do</w:t>
-      </w:r>
-    </w:p>
-    <w:p>
-      <w:pPr>
-        <w:spacing w:after="60" w:before="0"/>
-        <w:jc w:val="left"/>
-      </w:pPr>
-      <w:r>
-        <w:rPr>
-          <w:rFonts w:ascii="Arial" w:cs="Arial" w:eastAsia="Arial" w:hAnsi="Arial"/>
-          <w:color w:val="333333"/>
-          <w:sz w:val="21"/>
-          <w:szCs w:val="21"/>
-        </w:rPr>
-        <w:t xml:space="preserve">• Render an imported XML or .rfy as a real-looking wall in 2D — sticks drawn as actual steel sections (C-section profile visible), tool ops drawn as real punch shapes (notches, holes, dimple bumps).</w:t>
-      </w:r>
-    </w:p>
-    <w:p>
-      <w:pPr>
-        <w:spacing w:after="60" w:before="0"/>
-        <w:jc w:val="left"/>
-      </w:pPr>
-      <w:r>
-        <w:rPr>
-          <w:rFonts w:ascii="Arial" w:cs="Arial" w:eastAsia="Arial" w:hAnsi="Arial"/>
-          <w:color w:val="333333"/>
-          <w:sz w:val="21"/>
-          <w:szCs w:val="21"/>
-        </w:rPr>
-        <w:t xml:space="preserve">• Sidebar lists every frame in the imported file. Click a frame → it draws on the canvas.</w:t>
-      </w:r>
-    </w:p>
-    <w:p>
-      <w:pPr>
-        <w:spacing w:after="60" w:before="0"/>
-        <w:jc w:val="left"/>
-      </w:pPr>
-      <w:r>
-        <w:rPr>
-          <w:rFonts w:ascii="Arial" w:cs="Arial" w:eastAsia="Arial" w:hAnsi="Arial"/>
-          <w:color w:val="333333"/>
-          <w:sz w:val="21"/>
-          <w:szCs w:val="21"/>
-        </w:rPr>
-        <w:t xml:space="preserve">• Pan / zoom the wall view — GPU-accelerated, no lag.</w:t>
-      </w:r>
-    </w:p>
-    <w:p>
-      <w:pPr>
-        <w:spacing w:after="60" w:before="0"/>
-        <w:jc w:val="left"/>
-      </w:pPr>
-      <w:r>
-        <w:rPr>
-          <w:rFonts w:ascii="Arial" w:cs="Arial" w:eastAsia="Arial" w:hAnsi="Arial"/>
-          <w:color w:val="333333"/>
-          <w:sz w:val="21"/>
-          <w:szCs w:val="21"/>
-        </w:rPr>
-        <w:t xml:space="preserve">• Click a stick → side panel shows full op list + profile + length.</w:t>
-      </w:r>
-    </w:p>
-    <w:p>
-      <w:pPr>
-        <w:spacing w:after="60" w:before="0"/>
-        <w:jc w:val="left"/>
-      </w:pPr>
-      <w:r>
-        <w:rPr>
-          <w:rFonts w:ascii="Arial" w:cs="Arial" w:eastAsia="Arial" w:hAnsi="Arial"/>
-          <w:color w:val="333333"/>
-          <w:sz w:val="21"/>
-          <w:szCs w:val="21"/>
-        </w:rPr>
-        <w:t xml:space="preserve">• Click anywhere on a stick → "add tool op" menu — pick LipNotch, Swage, Bolt, etc., position it.</w:t>
-      </w:r>
-    </w:p>
-    <w:p>
-      <w:pPr>
-        <w:spacing w:after="60" w:before="0"/>
-        <w:jc w:val="left"/>
-      </w:pPr>
-      <w:r>
-        <w:rPr>
-          <w:rFonts w:ascii="Arial" w:cs="Arial" w:eastAsia="Arial" w:hAnsi="Arial"/>
-          <w:color w:val="333333"/>
-          <w:sz w:val="21"/>
-          <w:szCs w:val="21"/>
-        </w:rPr>
-        <w:t xml:space="preserve">• Drag stick endpoints to resize. Drag a stick to move it.</w:t>
-      </w:r>
-    </w:p>
-    <w:p>
-      <w:pPr>
-        <w:spacing w:after="60" w:before="0"/>
-        <w:jc w:val="left"/>
-      </w:pPr>
-      <w:r>
-        <w:rPr>
-          <w:rFonts w:ascii="Arial" w:cs="Arial" w:eastAsia="Arial" w:hAnsi="Arial"/>
-          <w:color w:val="333333"/>
-          <w:sz w:val="21"/>
-          <w:szCs w:val="21"/>
-        </w:rPr>
-        <w:t xml:space="preserve">• Click empty wall area → add a new stick.</w:t>
-      </w:r>
-    </w:p>
-    <w:p>
-      <w:pPr>
-        <w:spacing w:after="60" w:before="0"/>
-        <w:jc w:val="left"/>
-      </w:pPr>
-      <w:r>
-        <w:rPr>
-          <w:rFonts w:ascii="Arial" w:cs="Arial" w:eastAsia="Arial" w:hAnsi="Arial"/>
-          <w:color w:val="333333"/>
-          <w:sz w:val="21"/>
-          <w:szCs w:val="21"/>
-        </w:rPr>
-        <w:t xml:space="preserve">• Right-click an op → delete or change type.</w:t>
-      </w:r>
-    </w:p>
-    <w:p>
-      <w:pPr>
-        <w:spacing w:after="60" w:before="0"/>
-        <w:jc w:val="left"/>
-      </w:pPr>
-      <w:r>
-        <w:rPr>
-          <w:rFonts w:ascii="Arial" w:cs="Arial" w:eastAsia="Arial" w:hAnsi="Arial"/>
-          <w:color w:val="333333"/>
-          <w:sz w:val="21"/>
-          <w:szCs w:val="21"/>
-        </w:rPr>
-        <w:t xml:space="preserve">• Undo / redo on every action.</w:t>
-      </w:r>
-    </w:p>
-    <w:p>
-      <w:pPr>
-        <w:spacing w:after="60" w:before="0"/>
-        <w:jc w:val="left"/>
-      </w:pPr>
-      <w:r>
-        <w:rPr>
-          <w:rFonts w:ascii="Arial" w:cs="Arial" w:eastAsia="Arial" w:hAnsi="Arial"/>
-          <w:color w:val="333333"/>
-          <w:sz w:val="21"/>
-          <w:szCs w:val="21"/>
-        </w:rPr>
-        <w:t xml:space="preserve">• "Save" button — exports the edited wall back to a downloadable .rfy file ready for the F300i.</w:t>
+        <w:t xml:space="preserve">10.1  How to use it</w:t>
+      </w:r>
+    </w:p>
+    <w:p>
+      <w:pPr>
+        <w:spacing w:after="80" w:before="0"/>
+        <w:jc w:val="left"/>
+      </w:pPr>
+      <w:r>
+        <w:rPr>
+          <w:rFonts w:ascii="Arial" w:cs="Arial" w:eastAsia="Arial" w:hAnsi="Arial"/>
+          <w:color w:val="333333"/>
+          <w:sz w:val="21"/>
+          <w:szCs w:val="21"/>
+        </w:rPr>
+        <w:t xml:space="preserve">1. Drop a .rfy or input .xml file anywhere on the /viewer page. The wall renders in real-world style — sticks drawn as actual steel sections with visible C-section flange depth, tool ops drawn as their actual physical shape (real notch geometry, real holes, real swage bumps).</w:t>
+      </w:r>
+    </w:p>
+    <w:p>
+      <w:pPr>
+        <w:spacing w:after="80" w:before="0"/>
+        <w:jc w:val="left"/>
+      </w:pPr>
+      <w:r>
+        <w:rPr>
+          <w:rFonts w:ascii="Arial" w:cs="Arial" w:eastAsia="Arial" w:hAnsi="Arial"/>
+          <w:color w:val="333333"/>
+          <w:sz w:val="21"/>
+          <w:szCs w:val="21"/>
+        </w:rPr>
+        <w:t xml:space="preserve">2. Sidebar lists every frame in the imported file. Click a frame to render it on the canvas. The wall auto-fits the viewport.</w:t>
+      </w:r>
+    </w:p>
+    <w:p>
+      <w:pPr>
+        <w:spacing w:after="80" w:before="0"/>
+        <w:jc w:val="left"/>
+      </w:pPr>
+      <w:r>
+        <w:rPr>
+          <w:rFonts w:ascii="Arial" w:cs="Arial" w:eastAsia="Arial" w:hAnsi="Arial"/>
+          <w:color w:val="333333"/>
+          <w:sz w:val="21"/>
+          <w:szCs w:val="21"/>
+        </w:rPr>
+        <w:t xml:space="preserve">3. Drag empty canvas to pan. Mouse wheel to zoom — both crisp at any zoom level.</w:t>
+      </w:r>
+    </w:p>
+    <w:p>
+      <w:pPr>
+        <w:spacing w:after="80" w:before="0"/>
+        <w:jc w:val="left"/>
+      </w:pPr>
+      <w:r>
+        <w:rPr>
+          <w:rFonts w:ascii="Arial" w:cs="Arial" w:eastAsia="Arial" w:hAnsi="Arial"/>
+          <w:color w:val="333333"/>
+          <w:sz w:val="21"/>
+          <w:szCs w:val="21"/>
+        </w:rPr>
+        <w:t xml:space="preserve">4. Click a stick to select it (highlights in HYTEK yellow). The sidebar's bottom panel shows the stick's profile, length, role, and full ordered op list.</w:t>
+      </w:r>
+    </w:p>
+    <w:p>
+      <w:pPr>
+        <w:spacing w:after="80" w:before="0"/>
+        <w:jc w:val="left"/>
+      </w:pPr>
+      <w:r>
+        <w:rPr>
+          <w:rFonts w:ascii="Arial" w:cs="Arial" w:eastAsia="Arial" w:hAnsi="Arial"/>
+          <w:color w:val="333333"/>
+          <w:sz w:val="21"/>
+          <w:szCs w:val="21"/>
+        </w:rPr>
+        <w:t xml:space="preserve">5. + Add op: opens a dialog with the tool-type dropdown (all 14 types) and a position input. Sensible defaults — spanned types get a 39mm centred span, point types get the position you specify.</w:t>
+      </w:r>
+    </w:p>
+    <w:p>
+      <w:pPr>
+        <w:spacing w:after="80" w:before="0"/>
+        <w:jc w:val="left"/>
+      </w:pPr>
+      <w:r>
+        <w:rPr>
+          <w:rFonts w:ascii="Arial" w:cs="Arial" w:eastAsia="Arial" w:hAnsi="Arial"/>
+          <w:color w:val="333333"/>
+          <w:sz w:val="21"/>
+          <w:szCs w:val="21"/>
+        </w:rPr>
+        <w:t xml:space="preserve">6. Hover any op in the side list → red ✕ to delete it. Logged to undo history.</w:t>
+      </w:r>
+    </w:p>
+    <w:p>
+      <w:pPr>
+        <w:spacing w:after="80" w:before="0"/>
+        <w:jc w:val="left"/>
+      </w:pPr>
+      <w:r>
+        <w:rPr>
+          <w:rFonts w:ascii="Arial" w:cs="Arial" w:eastAsia="Arial" w:hAnsi="Arial"/>
+          <w:color w:val="333333"/>
+          <w:sz w:val="21"/>
+          <w:szCs w:val="21"/>
+        </w:rPr>
+        <w:t xml:space="preserve">7. Drag the body of a SELECTED stick to move it. Drag the yellow circle handles at each end to resize/reorient.</w:t>
+      </w:r>
+    </w:p>
+    <w:p>
+      <w:pPr>
+        <w:spacing w:after="80" w:before="0"/>
+        <w:jc w:val="left"/>
+      </w:pPr>
+      <w:r>
+        <w:rPr>
+          <w:rFonts w:ascii="Arial" w:cs="Arial" w:eastAsia="Arial" w:hAnsi="Arial"/>
+          <w:color w:val="333333"/>
+          <w:sz w:val="21"/>
+          <w:szCs w:val="21"/>
+        </w:rPr>
+        <w:t xml:space="preserve">8. ✏ Draw stick mode: click the toolbar button (cursor becomes crosshair), drag on the canvas to define a new stick by start → end midline. Releases commits via addStick. Default profile: 70 S 41 / 0.75mm.</w:t>
+      </w:r>
+    </w:p>
+    <w:p>
+      <w:pPr>
+        <w:spacing w:after="80" w:before="0"/>
+        <w:jc w:val="left"/>
+      </w:pPr>
+      <w:r>
+        <w:rPr>
+          <w:rFonts w:ascii="Arial" w:cs="Arial" w:eastAsia="Arial" w:hAnsi="Arial"/>
+          <w:color w:val="333333"/>
+          <w:sz w:val="21"/>
+          <w:szCs w:val="21"/>
+        </w:rPr>
+        <w:t xml:space="preserve">9. Undo/redo: ↶ Undo and ↷ Redo buttons in the header, or Ctrl+Z / Ctrl+Shift+Z keyboard shortcuts. Up to 100 steps of history per session.</w:t>
+      </w:r>
+    </w:p>
+    <w:p>
+      <w:pPr>
+        <w:spacing w:after="80" w:before="0"/>
+        <w:jc w:val="left"/>
+      </w:pPr>
+      <w:r>
+        <w:rPr>
+          <w:rFonts w:ascii="Arial" w:cs="Arial" w:eastAsia="Arial" w:hAnsi="Arial"/>
+          <w:color w:val="333333"/>
+          <w:sz w:val="21"/>
+          <w:szCs w:val="21"/>
+        </w:rPr>
+        <w:t xml:space="preserve">10. 💾 Save: when the document is dirty (yellow ● marker next to filename), click Save to download an updated .rfy file ready for the F300i. The save round-trips through /api/encode — your edited document gets serialised back to schedule XML and re-encrypted.</w:t>
       </w:r>
     </w:p>
     <w:p>
@@ -4522,7 +4539,7 @@
           <w:sz w:val="28"/>
           <w:szCs w:val="28"/>
         </w:rPr>
-        <w:t xml:space="preserve">10.2  What it will NOT do</w:t>
+        <w:t xml:space="preserve">10.2  What it edits — and what it doesn't</w:t>
       </w:r>
     </w:p>
     <w:p>
@@ -4556,135 +4573,374 @@
           <w:sz w:val="28"/>
           <w:szCs w:val="28"/>
         </w:rPr>
-        <w:t xml:space="preserve">10.3  Build approach (already locked in)</w:t>
-      </w:r>
-    </w:p>
-    <w:p>
-      <w:pPr>
-        <w:spacing w:after="30" w:before="0"/>
-        <w:jc w:val="left"/>
-      </w:pPr>
-      <w:r>
-        <w:rPr>
-          <w:rFonts w:ascii="Arial" w:cs="Arial" w:eastAsia="Arial" w:hAnsi="Arial"/>
-          <w:b/>
-          <w:bCs/>
-          <w:color w:val="231F20"/>
-          <w:sz w:val="21"/>
-          <w:szCs w:val="21"/>
-        </w:rPr>
-        <w:t xml:space="preserve">Stack</w:t>
-      </w:r>
-    </w:p>
-    <w:p>
-      <w:pPr>
-        <w:spacing w:after="140" w:before="0"/>
-        <w:jc w:val="left"/>
-      </w:pPr>
-      <w:r>
-        <w:rPr>
-          <w:rFonts w:ascii="Arial" w:cs="Arial" w:eastAsia="Arial" w:hAnsi="Arial"/>
-          <w:color w:val="333333"/>
-          <w:sz w:val="21"/>
-          <w:szCs w:val="21"/>
-        </w:rPr>
-        <w:t xml:space="preserve">    Pure SVG + React + Zustand. No 3rd-party drawing library — full control over how steel and tool ops render.</w:t>
-      </w:r>
-    </w:p>
-    <w:p>
-      <w:pPr>
-        <w:spacing w:after="30" w:before="0"/>
-        <w:jc w:val="left"/>
-      </w:pPr>
-      <w:r>
-        <w:rPr>
-          <w:rFonts w:ascii="Arial" w:cs="Arial" w:eastAsia="Arial" w:hAnsi="Arial"/>
-          <w:b/>
-          <w:bCs/>
-          <w:color w:val="231F20"/>
-          <w:sz w:val="21"/>
-          <w:szCs w:val="21"/>
-        </w:rPr>
-        <w:t xml:space="preserve">Visual fidelity</w:t>
-      </w:r>
-    </w:p>
-    <w:p>
-      <w:pPr>
-        <w:spacing w:after="140" w:before="0"/>
-        <w:jc w:val="left"/>
-      </w:pPr>
-      <w:r>
-        <w:rPr>
-          <w:rFonts w:ascii="Arial" w:cs="Arial" w:eastAsia="Arial" w:hAnsi="Arial"/>
-          <w:color w:val="333333"/>
-          <w:sz w:val="21"/>
-          <w:szCs w:val="21"/>
-        </w:rPr>
-        <w:t xml:space="preserve">    2D realistic — sticks drawn with steel shading + C-section flange shadow visible. Tool ops drawn as actual punch geometry, not abstract symbols. Looks like a manufacturing drawing.</w:t>
-      </w:r>
-    </w:p>
-    <w:p>
-      <w:pPr>
-        <w:spacing w:after="30" w:before="0"/>
-        <w:jc w:val="left"/>
-      </w:pPr>
-      <w:r>
-        <w:rPr>
-          <w:rFonts w:ascii="Arial" w:cs="Arial" w:eastAsia="Arial" w:hAnsi="Arial"/>
-          <w:b/>
-          <w:bCs/>
-          <w:color w:val="231F20"/>
-          <w:sz w:val="21"/>
-          <w:szCs w:val="21"/>
-        </w:rPr>
-        <w:t xml:space="preserve">Build sequence</w:t>
-      </w:r>
-    </w:p>
-    <w:p>
-      <w:pPr>
-        <w:spacing w:after="140" w:before="0"/>
-        <w:jc w:val="left"/>
-      </w:pPr>
-      <w:r>
-        <w:rPr>
-          <w:rFonts w:ascii="Arial" w:cs="Arial" w:eastAsia="Arial" w:hAnsi="Arial"/>
-          <w:color w:val="333333"/>
-          <w:sz w:val="21"/>
-          <w:szCs w:val="21"/>
-        </w:rPr>
-        <w:t xml:space="preserve">    Read-only viewer first (~3-4 weeks), then add tool-op editing (~2 weeks), then stick move/add (~2 weeks). Each stage ships independently — production stays unaffected throughout.</w:t>
-      </w:r>
-    </w:p>
-    <w:p>
-      <w:pPr>
-        <w:spacing w:after="30" w:before="0"/>
-        <w:jc w:val="left"/>
-      </w:pPr>
-      <w:r>
-        <w:rPr>
-          <w:rFonts w:ascii="Arial" w:cs="Arial" w:eastAsia="Arial" w:hAnsi="Arial"/>
-          <w:b/>
-          <w:bCs/>
-          <w:color w:val="231F20"/>
-          <w:sz w:val="21"/>
-          <w:szCs w:val="21"/>
-        </w:rPr>
-        <w:t xml:space="preserve">Isolation</w:t>
-      </w:r>
-    </w:p>
-    <w:p>
-      <w:pPr>
-        <w:spacing w:after="140" w:before="0"/>
-        <w:jc w:val="left"/>
-      </w:pPr>
-      <w:r>
-        <w:rPr>
-          <w:rFonts w:ascii="Arial" w:cs="Arial" w:eastAsia="Arial" w:hAnsi="Arial"/>
-          <w:color w:val="333333"/>
-          <w:sz w:val="21"/>
-          <w:szCs w:val="21"/>
-        </w:rPr>
-        <w:t xml:space="preserve">    Lives entirely under app/viewer/ in the repo. Hidden from nav until v1 ships. No risk of breaking /, /rules, /rules/tooling, or /regression while it's being built.</w:t>
+        <w:t xml:space="preserve">10.3  Tool-op shapes (visual key)</w:t>
+      </w:r>
+    </w:p>
+    <w:p>
+      <w:pPr>
+        <w:spacing w:after="120" w:before="0"/>
+        <w:jc w:val="left"/>
+      </w:pPr>
+      <w:r>
+        <w:rPr>
+          <w:rFonts w:ascii="Arial" w:cs="Arial" w:eastAsia="Arial" w:hAnsi="Arial"/>
+          <w:color w:val="333333"/>
+          <w:sz w:val="21"/>
+          <w:szCs w:val="21"/>
+        </w:rPr>
+        <w:t xml:space="preserve">Each tool-op type is drawn as its actual physical shape so you can read the wall picture at a glance:</w:t>
+      </w:r>
+    </w:p>
+    <w:p>
+      <w:pPr>
+        <w:spacing w:after="30" w:before="0"/>
+        <w:jc w:val="left"/>
+      </w:pPr>
+      <w:r>
+        <w:rPr>
+          <w:rFonts w:ascii="Arial" w:cs="Arial" w:eastAsia="Arial" w:hAnsi="Arial"/>
+          <w:b/>
+          <w:bCs/>
+          <w:color w:val="231F20"/>
+          <w:sz w:val="21"/>
+          <w:szCs w:val="21"/>
+        </w:rPr>
+        <w:t xml:space="preserve">InnerDimple</w:t>
+      </w:r>
+    </w:p>
+    <w:p>
+      <w:pPr>
+        <w:spacing w:after="140" w:before="0"/>
+        <w:jc w:val="left"/>
+      </w:pPr>
+      <w:r>
+        <w:rPr>
+          <w:rFonts w:ascii="Arial" w:cs="Arial" w:eastAsia="Arial" w:hAnsi="Arial"/>
+          <w:color w:val="333333"/>
+          <w:sz w:val="21"/>
+          <w:szCs w:val="21"/>
+        </w:rPr>
+        <w:t xml:space="preserve">    Small dome circle with a lighter highlight — pre-punched indent.</w:t>
+      </w:r>
+    </w:p>
+    <w:p>
+      <w:pPr>
+        <w:spacing w:after="30" w:before="0"/>
+        <w:jc w:val="left"/>
+      </w:pPr>
+      <w:r>
+        <w:rPr>
+          <w:rFonts w:ascii="Arial" w:cs="Arial" w:eastAsia="Arial" w:hAnsi="Arial"/>
+          <w:b/>
+          <w:bCs/>
+          <w:color w:val="231F20"/>
+          <w:sz w:val="21"/>
+          <w:szCs w:val="21"/>
+        </w:rPr>
+        <w:t xml:space="preserve">Swage</w:t>
+      </w:r>
+    </w:p>
+    <w:p>
+      <w:pPr>
+        <w:spacing w:after="140" w:before="0"/>
+        <w:jc w:val="left"/>
+      </w:pPr>
+      <w:r>
+        <w:rPr>
+          <w:rFonts w:ascii="Arial" w:cs="Arial" w:eastAsia="Arial" w:hAnsi="Arial"/>
+          <w:color w:val="333333"/>
+          <w:sz w:val="21"/>
+          <w:szCs w:val="21"/>
+        </w:rPr>
+        <w:t xml:space="preserve">    Oval bump 14mm × 6mm with highlight — stiffening rib.</w:t>
+      </w:r>
+    </w:p>
+    <w:p>
+      <w:pPr>
+        <w:spacing w:after="30" w:before="0"/>
+        <w:jc w:val="left"/>
+      </w:pPr>
+      <w:r>
+        <w:rPr>
+          <w:rFonts w:ascii="Arial" w:cs="Arial" w:eastAsia="Arial" w:hAnsi="Arial"/>
+          <w:b/>
+          <w:bCs/>
+          <w:color w:val="231F20"/>
+          <w:sz w:val="21"/>
+          <w:szCs w:val="21"/>
+        </w:rPr>
+        <w:t xml:space="preserve">LipNotch</w:t>
+      </w:r>
+    </w:p>
+    <w:p>
+      <w:pPr>
+        <w:spacing w:after="140" w:before="0"/>
+        <w:jc w:val="left"/>
+      </w:pPr>
+      <w:r>
+        <w:rPr>
+          <w:rFonts w:ascii="Arial" w:cs="Arial" w:eastAsia="Arial" w:hAnsi="Arial"/>
+          <w:color w:val="333333"/>
+          <w:sz w:val="21"/>
+          <w:szCs w:val="21"/>
+        </w:rPr>
+        <w:t xml:space="preserve">    V-cut on each lip edge — appears at every stud crossing.</w:t>
+      </w:r>
+    </w:p>
+    <w:p>
+      <w:pPr>
+        <w:spacing w:after="30" w:before="0"/>
+        <w:jc w:val="left"/>
+      </w:pPr>
+      <w:r>
+        <w:rPr>
+          <w:rFonts w:ascii="Arial" w:cs="Arial" w:eastAsia="Arial" w:hAnsi="Arial"/>
+          <w:b/>
+          <w:bCs/>
+          <w:color w:val="231F20"/>
+          <w:sz w:val="21"/>
+          <w:szCs w:val="21"/>
+        </w:rPr>
+        <w:t xml:space="preserve">LeftFlange / RightFlange</w:t>
+      </w:r>
+    </w:p>
+    <w:p>
+      <w:pPr>
+        <w:spacing w:after="140" w:before="0"/>
+        <w:jc w:val="left"/>
+      </w:pPr>
+      <w:r>
+        <w:rPr>
+          <w:rFonts w:ascii="Arial" w:cs="Arial" w:eastAsia="Arial" w:hAnsi="Arial"/>
+          <w:color w:val="333333"/>
+          <w:sz w:val="21"/>
+          <w:szCs w:val="21"/>
+        </w:rPr>
+        <w:t xml:space="preserve">    Single-side V-cut variant of LipNotch.</w:t>
+      </w:r>
+    </w:p>
+    <w:p>
+      <w:pPr>
+        <w:spacing w:after="30" w:before="0"/>
+        <w:jc w:val="left"/>
+      </w:pPr>
+      <w:r>
+        <w:rPr>
+          <w:rFonts w:ascii="Arial" w:cs="Arial" w:eastAsia="Arial" w:hAnsi="Arial"/>
+          <w:b/>
+          <w:bCs/>
+          <w:color w:val="231F20"/>
+          <w:sz w:val="21"/>
+          <w:szCs w:val="21"/>
+        </w:rPr>
+        <w:t xml:space="preserve">LeftPartialFlange / RightPartialFlange</w:t>
+      </w:r>
+    </w:p>
+    <w:p>
+      <w:pPr>
+        <w:spacing w:after="140" w:before="0"/>
+        <w:jc w:val="left"/>
+      </w:pPr>
+      <w:r>
+        <w:rPr>
+          <w:rFonts w:ascii="Arial" w:cs="Arial" w:eastAsia="Arial" w:hAnsi="Arial"/>
+          <w:color w:val="333333"/>
+          <w:sz w:val="21"/>
+          <w:szCs w:val="21"/>
+        </w:rPr>
+        <w:t xml:space="preserve">    Half-depth V-cut on one side.</w:t>
+      </w:r>
+    </w:p>
+    <w:p>
+      <w:pPr>
+        <w:spacing w:after="30" w:before="0"/>
+        <w:jc w:val="left"/>
+      </w:pPr>
+      <w:r>
+        <w:rPr>
+          <w:rFonts w:ascii="Arial" w:cs="Arial" w:eastAsia="Arial" w:hAnsi="Arial"/>
+          <w:b/>
+          <w:bCs/>
+          <w:color w:val="231F20"/>
+          <w:sz w:val="21"/>
+          <w:szCs w:val="21"/>
+        </w:rPr>
+        <w:t xml:space="preserve">InnerNotch (WEB NOTCH)</w:t>
+      </w:r>
+    </w:p>
+    <w:p>
+      <w:pPr>
+        <w:spacing w:after="140" w:before="0"/>
+        <w:jc w:val="left"/>
+      </w:pPr>
+      <w:r>
+        <w:rPr>
+          <w:rFonts w:ascii="Arial" w:cs="Arial" w:eastAsia="Arial" w:hAnsi="Arial"/>
+          <w:color w:val="333333"/>
+          <w:sz w:val="21"/>
+          <w:szCs w:val="21"/>
+        </w:rPr>
+        <w:t xml:space="preserve">    Rectangular notch in the web — fitment cutout.</w:t>
+      </w:r>
+    </w:p>
+    <w:p>
+      <w:pPr>
+        <w:spacing w:after="30" w:before="0"/>
+        <w:jc w:val="left"/>
+      </w:pPr>
+      <w:r>
+        <w:rPr>
+          <w:rFonts w:ascii="Arial" w:cs="Arial" w:eastAsia="Arial" w:hAnsi="Arial"/>
+          <w:b/>
+          <w:bCs/>
+          <w:color w:val="231F20"/>
+          <w:sz w:val="21"/>
+          <w:szCs w:val="21"/>
+        </w:rPr>
+        <w:t xml:space="preserve">Web (BOLT HOLES)</w:t>
+      </w:r>
+    </w:p>
+    <w:p>
+      <w:pPr>
+        <w:spacing w:after="140" w:before="0"/>
+        <w:jc w:val="left"/>
+      </w:pPr>
+      <w:r>
+        <w:rPr>
+          <w:rFonts w:ascii="Arial" w:cs="Arial" w:eastAsia="Arial" w:hAnsi="Arial"/>
+          <w:color w:val="333333"/>
+          <w:sz w:val="21"/>
+          <w:szCs w:val="21"/>
+        </w:rPr>
+        <w:t xml:space="preserve">    Filled circle through the web — pass-through bolt hole.</w:t>
+      </w:r>
+    </w:p>
+    <w:p>
+      <w:pPr>
+        <w:spacing w:after="30" w:before="0"/>
+        <w:jc w:val="left"/>
+      </w:pPr>
+      <w:r>
+        <w:rPr>
+          <w:rFonts w:ascii="Arial" w:cs="Arial" w:eastAsia="Arial" w:hAnsi="Arial"/>
+          <w:b/>
+          <w:bCs/>
+          <w:color w:val="231F20"/>
+          <w:sz w:val="21"/>
+          <w:szCs w:val="21"/>
+        </w:rPr>
+        <w:t xml:space="preserve">Bolt (ANCHOR)</w:t>
+      </w:r>
+    </w:p>
+    <w:p>
+      <w:pPr>
+        <w:spacing w:after="140" w:before="0"/>
+        <w:jc w:val="left"/>
+      </w:pPr>
+      <w:r>
+        <w:rPr>
+          <w:rFonts w:ascii="Arial" w:cs="Arial" w:eastAsia="Arial" w:hAnsi="Arial"/>
+          <w:color w:val="333333"/>
+          <w:sz w:val="21"/>
+          <w:szCs w:val="21"/>
+        </w:rPr>
+        <w:t xml:space="preserve">    Larger filled circle with darker inner ring — anchor bolt into slab.</w:t>
+      </w:r>
+    </w:p>
+    <w:p>
+      <w:pPr>
+        <w:spacing w:after="30" w:before="0"/>
+        <w:jc w:val="left"/>
+      </w:pPr>
+      <w:r>
+        <w:rPr>
+          <w:rFonts w:ascii="Arial" w:cs="Arial" w:eastAsia="Arial" w:hAnsi="Arial"/>
+          <w:b/>
+          <w:bCs/>
+          <w:color w:val="231F20"/>
+          <w:sz w:val="21"/>
+          <w:szCs w:val="21"/>
+        </w:rPr>
+        <w:t xml:space="preserve">ScrewHoles (ANCHOR cluster)</w:t>
+      </w:r>
+    </w:p>
+    <w:p>
+      <w:pPr>
+        <w:spacing w:after="140" w:before="0"/>
+        <w:jc w:val="left"/>
+      </w:pPr>
+      <w:r>
+        <w:rPr>
+          <w:rFonts w:ascii="Arial" w:cs="Arial" w:eastAsia="Arial" w:hAnsi="Arial"/>
+          <w:color w:val="333333"/>
+          <w:sz w:val="21"/>
+          <w:szCs w:val="21"/>
+        </w:rPr>
+        <w:t xml:space="preserve">    Three small filled circles — chord-pair screw cluster.</w:t>
+      </w:r>
+    </w:p>
+    <w:p>
+      <w:pPr>
+        <w:spacing w:after="30" w:before="0"/>
+        <w:jc w:val="left"/>
+      </w:pPr>
+      <w:r>
+        <w:rPr>
+          <w:rFonts w:ascii="Arial" w:cs="Arial" w:eastAsia="Arial" w:hAnsi="Arial"/>
+          <w:b/>
+          <w:bCs/>
+          <w:color w:val="231F20"/>
+          <w:sz w:val="21"/>
+          <w:szCs w:val="21"/>
+        </w:rPr>
+        <w:t xml:space="preserve">InnerService (SERVICE HOLE)</w:t>
+      </w:r>
+    </w:p>
+    <w:p>
+      <w:pPr>
+        <w:spacing w:after="140" w:before="0"/>
+        <w:jc w:val="left"/>
+      </w:pPr>
+      <w:r>
+        <w:rPr>
+          <w:rFonts w:ascii="Arial" w:cs="Arial" w:eastAsia="Arial" w:hAnsi="Arial"/>
+          <w:color w:val="333333"/>
+          <w:sz w:val="21"/>
+          <w:szCs w:val="21"/>
+        </w:rPr>
+        <w:t xml:space="preserve">    Oval slot 10mm × 5mm — cable / pipe pass-through.</w:t>
+      </w:r>
+    </w:p>
+    <w:p>
+      <w:pPr>
+        <w:spacing w:after="30" w:before="0"/>
+        <w:jc w:val="left"/>
+      </w:pPr>
+      <w:r>
+        <w:rPr>
+          <w:rFonts w:ascii="Arial" w:cs="Arial" w:eastAsia="Arial" w:hAnsi="Arial"/>
+          <w:b/>
+          <w:bCs/>
+          <w:color w:val="231F20"/>
+          <w:sz w:val="21"/>
+          <w:szCs w:val="21"/>
+        </w:rPr>
+        <w:t xml:space="preserve">Chamfer / TrussChamfer</w:t>
+      </w:r>
+    </w:p>
+    <w:p>
+      <w:pPr>
+        <w:spacing w:after="140" w:before="0"/>
+        <w:jc w:val="left"/>
+      </w:pPr>
+      <w:r>
+        <w:rPr>
+          <w:rFonts w:ascii="Arial" w:cs="Arial" w:eastAsia="Arial" w:hAnsi="Arial"/>
+          <w:color w:val="333333"/>
+          <w:sz w:val="21"/>
+          <w:szCs w:val="21"/>
+        </w:rPr>
+        <w:t xml:space="preserve">    Triangular corner cut — diagonal stick ends.</w:t>
       </w:r>
     </w:p>
     <w:p>
@@ -4701,22 +4957,167 @@
           <w:sz w:val="28"/>
           <w:szCs w:val="28"/>
         </w:rPr>
-        <w:t xml:space="preserve">10.4  When you'll see it</w:t>
-      </w:r>
-    </w:p>
-    <w:p>
-      <w:pPr>
-        <w:spacing w:after="120" w:before="0"/>
-        <w:jc w:val="left"/>
-      </w:pPr>
-      <w:r>
-        <w:rPr>
-          <w:rFonts w:ascii="Arial" w:cs="Arial" w:eastAsia="Arial" w:hAnsi="Arial"/>
-          <w:color w:val="333333"/>
-          <w:sz w:val="21"/>
-          <w:szCs w:val="21"/>
-        </w:rPr>
-        <w:t xml:space="preserve">Read-only viewer (sees the wall, sees the ops, can't edit yet) targets ~3-4 weeks. Full editor with tool-op editing + stick move/add targets ~7-8 weeks total. Each stage will ship independently — you'll see the read-only viewer LIVE on hytek-rfy-tools.vercel.app first, then editing arrives on top of it without disturbing anything else.</w:t>
+        <w:t xml:space="preserve">10.4  Build approach (locked in)</w:t>
+      </w:r>
+    </w:p>
+    <w:p>
+      <w:pPr>
+        <w:spacing w:after="30" w:before="0"/>
+        <w:jc w:val="left"/>
+      </w:pPr>
+      <w:r>
+        <w:rPr>
+          <w:rFonts w:ascii="Arial" w:cs="Arial" w:eastAsia="Arial" w:hAnsi="Arial"/>
+          <w:b/>
+          <w:bCs/>
+          <w:color w:val="231F20"/>
+          <w:sz w:val="21"/>
+          <w:szCs w:val="21"/>
+        </w:rPr>
+        <w:t xml:space="preserve">Stack</w:t>
+      </w:r>
+    </w:p>
+    <w:p>
+      <w:pPr>
+        <w:spacing w:after="140" w:before="0"/>
+        <w:jc w:val="left"/>
+      </w:pPr>
+      <w:r>
+        <w:rPr>
+          <w:rFonts w:ascii="Arial" w:cs="Arial" w:eastAsia="Arial" w:hAnsi="Arial"/>
+          <w:color w:val="333333"/>
+          <w:sz w:val="21"/>
+          <w:szCs w:val="21"/>
+        </w:rPr>
+        <w:t xml:space="preserve">    Pure SVG + React + Zustand. No 3rd-party drawing library — full control over how steel and tool ops render.</w:t>
+      </w:r>
+    </w:p>
+    <w:p>
+      <w:pPr>
+        <w:spacing w:after="30" w:before="0"/>
+        <w:jc w:val="left"/>
+      </w:pPr>
+      <w:r>
+        <w:rPr>
+          <w:rFonts w:ascii="Arial" w:cs="Arial" w:eastAsia="Arial" w:hAnsi="Arial"/>
+          <w:b/>
+          <w:bCs/>
+          <w:color w:val="231F20"/>
+          <w:sz w:val="21"/>
+          <w:szCs w:val="21"/>
+        </w:rPr>
+        <w:t xml:space="preserve">Visual fidelity</w:t>
+      </w:r>
+    </w:p>
+    <w:p>
+      <w:pPr>
+        <w:spacing w:after="140" w:before="0"/>
+        <w:jc w:val="left"/>
+      </w:pPr>
+      <w:r>
+        <w:rPr>
+          <w:rFonts w:ascii="Arial" w:cs="Arial" w:eastAsia="Arial" w:hAnsi="Arial"/>
+          <w:color w:val="333333"/>
+          <w:sz w:val="21"/>
+          <w:szCs w:val="21"/>
+        </w:rPr>
+        <w:t xml:space="preserve">    2D realistic — sticks drawn with steel shading + C-section flange shadow visible. Tool ops drawn as actual punch geometry, not abstract symbols. Looks like a manufacturing drawing.</w:t>
+      </w:r>
+    </w:p>
+    <w:p>
+      <w:pPr>
+        <w:spacing w:after="30" w:before="0"/>
+        <w:jc w:val="left"/>
+      </w:pPr>
+      <w:r>
+        <w:rPr>
+          <w:rFonts w:ascii="Arial" w:cs="Arial" w:eastAsia="Arial" w:hAnsi="Arial"/>
+          <w:b/>
+          <w:bCs/>
+          <w:color w:val="231F20"/>
+          <w:sz w:val="21"/>
+          <w:szCs w:val="21"/>
+        </w:rPr>
+        <w:t xml:space="preserve">Performance</w:t>
+      </w:r>
+    </w:p>
+    <w:p>
+      <w:pPr>
+        <w:spacing w:after="140" w:before="0"/>
+        <w:jc w:val="left"/>
+      </w:pPr>
+      <w:r>
+        <w:rPr>
+          <w:rFonts w:ascii="Arial" w:cs="Arial" w:eastAsia="Arial" w:hAnsi="Arial"/>
+          <w:color w:val="333333"/>
+          <w:sz w:val="21"/>
+          <w:szCs w:val="21"/>
+        </w:rPr>
+        <w:t xml:space="preserve">    Renders one frame at a time (~600 SVG elements). Pan/zoom via SVG viewBox math (not CSS scale) so stroke widths stay crisp at any zoom. Frame switching is instant from in-memory model.</w:t>
+      </w:r>
+    </w:p>
+    <w:p>
+      <w:pPr>
+        <w:spacing w:after="30" w:before="0"/>
+        <w:jc w:val="left"/>
+      </w:pPr>
+      <w:r>
+        <w:rPr>
+          <w:rFonts w:ascii="Arial" w:cs="Arial" w:eastAsia="Arial" w:hAnsi="Arial"/>
+          <w:b/>
+          <w:bCs/>
+          <w:color w:val="231F20"/>
+          <w:sz w:val="21"/>
+          <w:szCs w:val="21"/>
+        </w:rPr>
+        <w:t xml:space="preserve">Isolation</w:t>
+      </w:r>
+    </w:p>
+    <w:p>
+      <w:pPr>
+        <w:spacing w:after="140" w:before="0"/>
+        <w:jc w:val="left"/>
+      </w:pPr>
+      <w:r>
+        <w:rPr>
+          <w:rFonts w:ascii="Arial" w:cs="Arial" w:eastAsia="Arial" w:hAnsi="Arial"/>
+          <w:color w:val="333333"/>
+          <w:sz w:val="21"/>
+          <w:szCs w:val="21"/>
+        </w:rPr>
+        <w:t xml:space="preserve">    Lives entirely under app/viewer/. Zero changes to /, /rules, /rules/tooling, /regression. The wall editor's save action only touches the downloaded .rfy file — never any rule files on disk.</w:t>
+      </w:r>
+    </w:p>
+    <w:p>
+      <w:pPr>
+        <w:spacing w:after="30" w:before="0"/>
+        <w:jc w:val="left"/>
+      </w:pPr>
+      <w:r>
+        <w:rPr>
+          <w:rFonts w:ascii="Arial" w:cs="Arial" w:eastAsia="Arial" w:hAnsi="Arial"/>
+          <w:b/>
+          <w:bCs/>
+          <w:color w:val="231F20"/>
+          <w:sz w:val="21"/>
+          <w:szCs w:val="21"/>
+        </w:rPr>
+        <w:t xml:space="preserve">Save round-trip</w:t>
+      </w:r>
+    </w:p>
+    <w:p>
+      <w:pPr>
+        <w:spacing w:after="140" w:before="0"/>
+        <w:jc w:val="left"/>
+      </w:pPr>
+      <w:r>
+        <w:rPr>
+          <w:rFonts w:ascii="Arial" w:cs="Arial" w:eastAsia="Arial" w:hAnsi="Arial"/>
+          <w:color w:val="333333"/>
+          <w:sz w:val="21"/>
+          <w:szCs w:val="21"/>
+        </w:rPr>
+        <w:t xml:space="preserve">    doc → documentToScheduleXml(doc) → POST /api/encode → encryptRfy → .rfy bytes → browser download. Existing /api/encode is reused — no new server endpoint needed.</w:t>
       </w:r>
     </w:p>
     <w:sectPr>

</xml_diff>